<commit_message>
Update CV to official Harvard ATS format with Kantor Walikota Medan DS experience
</commit_message>
<xml_diff>
--- a/CV_Ruth_Elvin.docx
+++ b/CV_Ruth_Elvin.docx
@@ -4,204 +4,277 @@
   <w:body>
     <w:p>
       <w:pPr>
-        <w:spacing w:before="0" w:after="20" w:line="247" w:lineRule="auto"/>
+        <w:spacing w:before="0" w:after="20" w:line="250" w:lineRule="auto"/>
         <w:jc w:val="center"/>
       </w:pPr>
       <w:r>
         <w:rPr>
-          <w:rFonts w:ascii="Arial" w:hAnsi="Arial"/>
+          <w:rFonts w:ascii="Times New Roman" w:hAnsi="Times New Roman"/>
           <w:b/>
-          <w:color w:val="003366"/>
-          <w:sz w:val="32"/>
+          <w:color w:val="000000"/>
+          <w:sz w:val="33"/>
         </w:rPr>
-        <w:t>RUTH ELVIN HARIANJA</w:t>
+        <w:t>RUTH ELVIN</w:t>
       </w:r>
     </w:p>
     <w:p>
       <w:pPr>
-        <w:spacing w:before="0" w:after="40" w:line="247" w:lineRule="auto"/>
+        <w:spacing w:before="0" w:after="40" w:line="250" w:lineRule="auto"/>
         <w:jc w:val="center"/>
       </w:pPr>
       <w:r>
         <w:rPr>
-          <w:rFonts w:ascii="Arial" w:hAnsi="Arial"/>
-          <w:b/>
-          <w:color w:val="4682B4"/>
-          <w:sz w:val="18"/>
+          <w:rFonts w:ascii="Times New Roman" w:hAnsi="Times New Roman"/>
+          <w:i/>
+          <w:color w:val="141414"/>
+          <w:sz w:val="19"/>
         </w:rPr>
-        <w:t>DATA SCIENTIST | AI &amp; MACHINE LEARNING ENGINEER</w:t>
+        <w:t>Data Scientist  |  Machine Learning Specialist</w:t>
       </w:r>
     </w:p>
     <w:p>
       <w:pPr>
-        <w:spacing w:before="0" w:after="60" w:line="247" w:lineRule="auto"/>
+        <w:spacing w:before="0" w:after="70" w:line="250" w:lineRule="auto"/>
         <w:jc w:val="center"/>
       </w:pPr>
       <w:r>
         <w:rPr>
-          <w:rFonts w:ascii="Arial" w:hAnsi="Arial"/>
-          <w:color w:val="5A5A5A"/>
-          <w:sz w:val="16"/>
+          <w:rFonts w:ascii="Times New Roman" w:hAnsi="Times New Roman"/>
+          <w:color w:val="464646"/>
+          <w:sz w:val="17"/>
         </w:rPr>
-        <w:t>Indonesia  |  +6281264866529  |  ruthelvinn@gmail.com  |  linkedin.com/in/ruthelvinn  |  github.com/ruth-elvin</w:t>
-      </w:r>
-    </w:p>
-    <w:p>
-      <w:pPr>
-        <w:spacing w:before="0" w:after="60"/>
-        <w:pBdr>
-          <w:bottom w:val="single" w:sz="12" w:space="1" w:color="003366"/>
-        </w:pBdr>
-      </w:pPr>
-    </w:p>
-    <w:p>
-      <w:pPr>
-        <w:keepNext/>
-        <w:spacing w:before="100" w:after="40"/>
-        <w:pBdr>
-          <w:bottom w:val="single" w:sz="10" w:space="2" w:color="003366"/>
-        </w:pBdr>
-      </w:pPr>
-      <w:r>
-        <w:rPr>
-          <w:rFonts w:ascii="Arial" w:hAnsi="Arial"/>
-          <w:b/>
-          <w:color w:val="003366"/>
-          <w:sz w:val="19"/>
-        </w:rPr>
-        <w:t>PROFESSIONAL SUMMARY</w:t>
-      </w:r>
-    </w:p>
-    <w:p>
-      <w:pPr>
-        <w:spacing w:before="0" w:after="60" w:line="247" w:lineRule="auto"/>
-        <w:jc w:val="left"/>
-      </w:pPr>
-      <w:r>
-        <w:t>Data Scientist &amp; Master's graduate in Data Science &amp; Artificial Intelligence (S2 DSAI) with a strong portfolio in end-to-end machine learning, predictive modeling, time series forecasting, and Explainable AI (XAI). Proficient in Python (Pandas, NumPy, Scikit-Learn, TensorFlow/Keras, PyOD, Statsmodels) and SQL. Proven track record of developing production-grade ML web applications (Flask, Streamlit), spatio-temporal anomaly detection engines (Isolation Forest, LOF, ECOD, DBSCAN, ST-DBSCAN), time series forecasting models (LSTM vs ARIMA), and complex behavioral feature engineering pipelines on large-scale datasets.</w:t>
+        <w:t>Medan, Indonesia  |  +6281264866529  |  ruthelvinn@gmail.com  |  linkedin.com/in/ruthelvinn  |  github.com/ruth-elvin</w:t>
       </w:r>
     </w:p>
     <w:p>
       <w:pPr>
         <w:keepNext/>
-        <w:spacing w:before="100" w:after="40"/>
+        <w:spacing w:before="90" w:after="40"/>
         <w:pBdr>
-          <w:bottom w:val="single" w:sz="10" w:space="2" w:color="003366"/>
+          <w:bottom w:val="single" w:sz="8" w:space="2" w:color="000000"/>
         </w:pBdr>
       </w:pPr>
       <w:r>
         <w:rPr>
-          <w:rFonts w:ascii="Arial" w:hAnsi="Arial"/>
+          <w:rFonts w:ascii="Times New Roman" w:hAnsi="Times New Roman"/>
           <w:b/>
-          <w:color w:val="003366"/>
-          <w:sz w:val="19"/>
+          <w:color w:val="000000"/>
+          <w:sz w:val="21"/>
         </w:rPr>
-        <w:t>TECHNICAL SKILLS &amp; COMPETENCIES</w:t>
-      </w:r>
-    </w:p>
-    <w:p>
-      <w:pPr>
-        <w:spacing w:before="0" w:after="20" w:line="245" w:lineRule="auto"/>
-        <w:jc w:val="left"/>
-      </w:pPr>
-      <w:r>
-        <w:rPr>
-          <w:b/>
-          <w:sz w:val="17"/>
-        </w:rPr>
-        <w:t xml:space="preserve">• Machine Learning &amp; AI: </w:t>
-      </w:r>
-      <w:r>
-        <w:rPr>
-          <w:sz w:val="17"/>
-        </w:rPr>
-        <w:t>Scikit-Learn, TensorFlow/Keras, PyOD (Isolation Forest, LOF, ECOD), Random Forest, Logistic Regression, SHAP (XAI), Genetic Algorithm, Perceptron ANN.</w:t>
-      </w:r>
-    </w:p>
-    <w:p>
-      <w:pPr>
-        <w:spacing w:before="0" w:after="20" w:line="245" w:lineRule="auto"/>
-        <w:jc w:val="left"/>
-      </w:pPr>
-      <w:r>
-        <w:rPr>
-          <w:b/>
-          <w:sz w:val="17"/>
-        </w:rPr>
-        <w:t xml:space="preserve">• Data Science &amp; Analytics: </w:t>
-      </w:r>
-      <w:r>
-        <w:rPr>
-          <w:sz w:val="17"/>
-        </w:rPr>
-        <w:t>Python (Pandas, NumPy), SQL, Time Series Forecasting (LSTM, ARIMA), Advanced Feature Engineering, Exploratory Data Analysis (EDA), Statsmodels.</w:t>
-      </w:r>
-    </w:p>
-    <w:p>
-      <w:pPr>
-        <w:spacing w:before="0" w:after="20" w:line="245" w:lineRule="auto"/>
-        <w:jc w:val="left"/>
-      </w:pPr>
-      <w:r>
-        <w:rPr>
-          <w:b/>
-          <w:sz w:val="17"/>
-        </w:rPr>
-        <w:t xml:space="preserve">• Geospatial &amp; Web Deployment: </w:t>
-      </w:r>
-      <w:r>
-        <w:rPr>
-          <w:sz w:val="17"/>
-        </w:rPr>
-        <w:t>Spatial DBSCAN, ST-DBSCAN (Spatio-Temporal), Haversine Distance, Dynamic Centroid Estimation, Flask, Streamlit, PyDeck 3D, Leaflet.js, Folium, Plotly.</w:t>
+        <w:t>EDUCATION</w:t>
       </w:r>
     </w:p>
     <w:p>
       <w:pPr>
         <w:keepNext/>
-        <w:spacing w:before="100" w:after="40"/>
-        <w:pBdr>
-          <w:bottom w:val="single" w:sz="10" w:space="2" w:color="003366"/>
-        </w:pBdr>
+        <w:spacing w:before="30" w:after="10" w:line="247" w:lineRule="auto"/>
+        <w:tabs>
+          <w:tab w:val="right" w:pos="10469"/>
+        </w:tabs>
       </w:pPr>
       <w:r>
         <w:rPr>
-          <w:rFonts w:ascii="Arial" w:hAnsi="Arial"/>
+          <w:rFonts w:ascii="Times New Roman" w:hAnsi="Times New Roman"/>
           <w:b/>
-          <w:color w:val="003366"/>
+          <w:color w:val="000000"/>
           <w:sz w:val="19"/>
         </w:rPr>
-        <w:t>FEATURED DATA SCIENCE &amp; AI PROJECTS</w:t>
+        <w:t>UNIVERSITAS SUMATERA UTARA (USU)</w:t>
+      </w:r>
+      <w:r>
+        <w:rPr>
+          <w:rFonts w:ascii="Times New Roman" w:hAnsi="Times New Roman"/>
+          <w:b/>
+          <w:color w:val="000000"/>
+          <w:sz w:val="19"/>
+        </w:rPr>
+        <w:tab/>
+        <w:t>Medan, Indonesia</w:t>
       </w:r>
     </w:p>
     <w:p>
       <w:pPr>
         <w:keepNext/>
-        <w:spacing w:before="40" w:after="20"/>
+        <w:spacing w:before="0" w:after="30" w:line="247" w:lineRule="auto"/>
         <w:tabs>
-          <w:tab w:val="right" w:pos="10700"/>
+          <w:tab w:val="right" w:pos="10469"/>
         </w:tabs>
       </w:pPr>
       <w:r>
         <w:rPr>
-          <w:b/>
-          <w:sz w:val="17"/>
+          <w:rFonts w:ascii="Times New Roman" w:hAnsi="Times New Roman"/>
+          <w:i/>
+          <w:color w:val="141414"/>
+          <w:sz w:val="18"/>
         </w:rPr>
-        <w:t>Early Warning System (EWS) Attendance Anomaly Detection Web App</w:t>
+        <w:t>Master of Science in Data Science &amp; Artificial Intelligence (S2 DSAI)</w:t>
       </w:r>
       <w:r>
         <w:rPr>
+          <w:rFonts w:ascii="Times New Roman" w:hAnsi="Times New Roman"/>
           <w:i/>
-          <w:color w:val="5A5A5A"/>
-          <w:sz w:val="16"/>
+          <w:color w:val="141414"/>
+          <w:sz w:val="18"/>
         </w:rPr>
-        <w:t xml:space="preserve"> (Flask, PyOD, SHAP, Leaflet.js)</w:t>
+        <w:tab/>
+        <w:t>2024 – 2026</w:t>
+      </w:r>
+    </w:p>
+    <w:p>
+      <w:pPr>
+        <w:pStyle w:val="ListBullet"/>
+        <w:spacing w:before="0" w:after="24" w:line="247" w:lineRule="auto"/>
+        <w:ind w:left="288"/>
+      </w:pPr>
+      <w:r>
+        <w:rPr>
+          <w:rFonts w:ascii="Times New Roman" w:hAnsi="Times New Roman"/>
+          <w:color w:val="141414"/>
+          <w:sz w:val="17"/>
+        </w:rPr>
+        <w:t>Thesis &amp; Research Focus: Geospatial Anomaly Detection, Spatio-Temporal Clustering (ST-DBSCAN), and Explainable AI (SHAP).</w:t>
+      </w:r>
+    </w:p>
+    <w:p>
+      <w:pPr>
+        <w:keepNext/>
+        <w:spacing w:before="40" w:after="10" w:line="247" w:lineRule="auto"/>
+        <w:tabs>
+          <w:tab w:val="right" w:pos="10469"/>
+        </w:tabs>
+      </w:pPr>
+      <w:r>
+        <w:rPr>
+          <w:rFonts w:ascii="Times New Roman" w:hAnsi="Times New Roman"/>
+          <w:b/>
+          <w:color w:val="000000"/>
+          <w:sz w:val="19"/>
+        </w:rPr>
+        <w:t>INSTITUT TEKNOLOGI DEL</w:t>
       </w:r>
       <w:r>
         <w:rPr>
+          <w:rFonts w:ascii="Times New Roman" w:hAnsi="Times New Roman"/>
           <w:b/>
-          <w:color w:val="003366"/>
-          <w:sz w:val="16"/>
+          <w:color w:val="000000"/>
+          <w:sz w:val="19"/>
+        </w:rPr>
+        <w:tab/>
+        <w:t>Toba, Indonesia</w:t>
+      </w:r>
+    </w:p>
+    <w:p>
+      <w:pPr>
+        <w:keepNext/>
+        <w:spacing w:before="0" w:after="30" w:line="247" w:lineRule="auto"/>
+        <w:tabs>
+          <w:tab w:val="right" w:pos="10469"/>
+        </w:tabs>
+      </w:pPr>
+      <w:r>
+        <w:rPr>
+          <w:rFonts w:ascii="Times New Roman" w:hAnsi="Times New Roman"/>
+          <w:i/>
+          <w:color w:val="141414"/>
+          <w:sz w:val="18"/>
+        </w:rPr>
+        <w:t>Bachelor of Applied Science in Software Engineering (D-IV RPL)</w:t>
+      </w:r>
+      <w:r>
+        <w:rPr>
+          <w:rFonts w:ascii="Times New Roman" w:hAnsi="Times New Roman"/>
+          <w:i/>
+          <w:color w:val="141414"/>
+          <w:sz w:val="18"/>
+        </w:rPr>
+        <w:tab/>
+        <w:t>2017 – 2021</w:t>
+      </w:r>
+    </w:p>
+    <w:p>
+      <w:pPr>
+        <w:pStyle w:val="ListBullet"/>
+        <w:spacing w:before="0" w:after="24" w:line="247" w:lineRule="auto"/>
+        <w:ind w:left="288"/>
+      </w:pPr>
+      <w:r>
+        <w:rPr>
+          <w:rFonts w:ascii="Times New Roman" w:hAnsi="Times New Roman"/>
+          <w:color w:val="141414"/>
+          <w:sz w:val="17"/>
+        </w:rPr>
+        <w:t>Graduated with comprehensive coursework in Algorithms, Data Structures, Database Systems, and Software Architecture.</w:t>
+      </w:r>
+    </w:p>
+    <w:p>
+      <w:pPr>
+        <w:keepNext/>
+        <w:spacing w:before="90" w:after="40"/>
+        <w:pBdr>
+          <w:bottom w:val="single" w:sz="8" w:space="2" w:color="000000"/>
+        </w:pBdr>
+      </w:pPr>
+      <w:r>
+        <w:rPr>
+          <w:rFonts w:ascii="Times New Roman" w:hAnsi="Times New Roman"/>
+          <w:b/>
+          <w:color w:val="000000"/>
+          <w:sz w:val="21"/>
+        </w:rPr>
+        <w:t>WORK EXPERIENCE</w:t>
+      </w:r>
+    </w:p>
+    <w:p>
+      <w:pPr>
+        <w:keepNext/>
+        <w:spacing w:before="40" w:after="10" w:line="247" w:lineRule="auto"/>
+        <w:tabs>
+          <w:tab w:val="right" w:pos="10469"/>
+        </w:tabs>
+      </w:pPr>
+      <w:r>
+        <w:rPr>
+          <w:rFonts w:ascii="Times New Roman" w:hAnsi="Times New Roman"/>
+          <w:b/>
+          <w:color w:val="000000"/>
+          <w:sz w:val="19"/>
+        </w:rPr>
+        <w:t>PEMERINTAH KOTA MEDAN (KANTOR WALIKOTA MEDAN)</w:t>
+      </w:r>
+      <w:r>
+        <w:rPr>
+          <w:rFonts w:ascii="Times New Roman" w:hAnsi="Times New Roman"/>
+          <w:b/>
+          <w:color w:val="000000"/>
+          <w:sz w:val="19"/>
+        </w:rPr>
+        <w:tab/>
+        <w:t>Medan, Indonesia</w:t>
+      </w:r>
+    </w:p>
+    <w:p>
+      <w:pPr>
+        <w:keepNext/>
+        <w:spacing w:before="0" w:after="30" w:line="247" w:lineRule="auto"/>
+        <w:tabs>
+          <w:tab w:val="right" w:pos="10469"/>
+        </w:tabs>
+      </w:pPr>
+      <w:r>
+        <w:rPr>
+          <w:rFonts w:ascii="Times New Roman" w:hAnsi="Times New Roman"/>
+          <w:i/>
+          <w:color w:val="141414"/>
+          <w:sz w:val="18"/>
+        </w:rPr>
+        <w:t>Data Science &amp; Machine Learning Intern</w:t>
+      </w:r>
+      <w:r>
+        <w:rPr>
+          <w:rFonts w:ascii="Times New Roman" w:hAnsi="Times New Roman"/>
+          <w:i/>
+          <w:color w:val="141414"/>
+          <w:sz w:val="18"/>
         </w:rPr>
         <w:tab/>
         <w:t>2025 – 2026</w:t>
@@ -210,289 +283,84 @@
     <w:p>
       <w:pPr>
         <w:pStyle w:val="ListBullet"/>
-        <w:spacing w:before="0" w:after="20" w:line="245" w:lineRule="auto"/>
+        <w:spacing w:before="0" w:after="24" w:line="247" w:lineRule="auto"/>
+        <w:ind w:left="288"/>
       </w:pPr>
       <w:r>
         <w:rPr>
-          <w:sz w:val="16"/>
+          <w:rFonts w:ascii="Times New Roman" w:hAnsi="Times New Roman"/>
+          <w:color w:val="141414"/>
+          <w:sz w:val="17"/>
         </w:rPr>
-        <w:t>Built an end-to-end production ML web app deploying Isolation Forest, LOF, and ECOD ensemble voting for geospatial anomaly detection.</w:t>
+        <w:t>Developed an interactive 3D analytics dashboard (Streamlit, ST-DBSCAN, PyDeck 3D) implementing spatio-temporal clustering and Haversine distance to detect attendance fraud and spatial deviations among civil servants.</w:t>
       </w:r>
     </w:p>
     <w:p>
       <w:pPr>
         <w:pStyle w:val="ListBullet"/>
-        <w:spacing w:before="0" w:after="20" w:line="245" w:lineRule="auto"/>
+        <w:spacing w:before="0" w:after="24" w:line="247" w:lineRule="auto"/>
+        <w:ind w:left="288"/>
       </w:pPr>
       <w:r>
         <w:rPr>
-          <w:sz w:val="16"/>
+          <w:rFonts w:ascii="Times New Roman" w:hAnsi="Times New Roman"/>
+          <w:color w:val="141414"/>
+          <w:sz w:val="17"/>
         </w:rPr>
-        <w:t>Integrated SHAP XAI for root-cause feature attribution, automated preprocessing pipelines, and interactive Leaflet.js mapping.</w:t>
+        <w:t>Engineered a multi-factor weighted risk scoring engine (stratified into LOW, MEDIUM, HIGH risk) to automate compliance audits and inform executive administrative decisions.</w:t>
       </w:r>
     </w:p>
     <w:p>
       <w:pPr>
         <w:keepNext/>
-        <w:spacing w:before="40" w:after="20"/>
+        <w:spacing w:before="50" w:after="10" w:line="247" w:lineRule="auto"/>
         <w:tabs>
-          <w:tab w:val="right" w:pos="10700"/>
+          <w:tab w:val="right" w:pos="10469"/>
         </w:tabs>
       </w:pPr>
       <w:r>
         <w:rPr>
+          <w:rFonts w:ascii="Times New Roman" w:hAnsi="Times New Roman"/>
           <w:b/>
-          <w:sz w:val="17"/>
+          <w:color w:val="000000"/>
+          <w:sz w:val="19"/>
         </w:rPr>
-        <w:t>Geospatial &amp; Spatio-Temporal Anomaly Scoring Dashboard</w:t>
+        <w:t>GOKOMODO</w:t>
       </w:r>
       <w:r>
         <w:rPr>
-          <w:i/>
-          <w:color w:val="5A5A5A"/>
-          <w:sz w:val="16"/>
-        </w:rPr>
-        <w:t xml:space="preserve"> (Streamlit, ST-DBSCAN, PyDeck 3D)</w:t>
-      </w:r>
-      <w:r>
-        <w:rPr>
+          <w:rFonts w:ascii="Times New Roman" w:hAnsi="Times New Roman"/>
           <w:b/>
-          <w:color w:val="003366"/>
-          <w:sz w:val="16"/>
+          <w:color w:val="000000"/>
+          <w:sz w:val="19"/>
         </w:rPr>
         <w:tab/>
-        <w:t>2025 – 2026</w:t>
-      </w:r>
-    </w:p>
-    <w:p>
-      <w:pPr>
-        <w:pStyle w:val="ListBullet"/>
-        <w:spacing w:before="0" w:after="20" w:line="245" w:lineRule="auto"/>
-      </w:pPr>
-      <w:r>
-        <w:rPr>
-          <w:sz w:val="16"/>
-        </w:rPr>
-        <w:t>Developed an interactive 3D analytics dashboard implementing ST-DBSCAN and Haversine distance for spatial/temporal noise identification.</w:t>
-      </w:r>
-    </w:p>
-    <w:p>
-      <w:pPr>
-        <w:pStyle w:val="ListBullet"/>
-        <w:spacing w:before="0" w:after="20" w:line="245" w:lineRule="auto"/>
-      </w:pPr>
-      <w:r>
-        <w:rPr>
-          <w:sz w:val="16"/>
-        </w:rPr>
-        <w:t>Engineered a multi-factor weighted risk scoring algorithm categorizing anomaly risk levels (LOW, MEDIUM, HIGH) for executive decision-making.</w:t>
+        <w:t>South Jakarta, Indonesia</w:t>
       </w:r>
     </w:p>
     <w:p>
       <w:pPr>
         <w:keepNext/>
-        <w:spacing w:before="40" w:after="20"/>
+        <w:spacing w:before="0" w:after="30" w:line="247" w:lineRule="auto"/>
         <w:tabs>
-          <w:tab w:val="right" w:pos="10700"/>
+          <w:tab w:val="right" w:pos="10469"/>
         </w:tabs>
       </w:pPr>
       <w:r>
         <w:rPr>
-          <w:b/>
-          <w:sz w:val="17"/>
+          <w:rFonts w:ascii="Times New Roman" w:hAnsi="Times New Roman"/>
+          <w:i/>
+          <w:color w:val="141414"/>
+          <w:sz w:val="18"/>
         </w:rPr>
-        <w:t>Beverages Sales Time Series Forecasting Engine</w:t>
+        <w:t>Quality Assurance Engineer (Full-time)</w:t>
       </w:r>
       <w:r>
         <w:rPr>
+          <w:rFonts w:ascii="Times New Roman" w:hAnsi="Times New Roman"/>
           <w:i/>
-          <w:color w:val="5A5A5A"/>
-          <w:sz w:val="16"/>
-        </w:rPr>
-        <w:t xml:space="preserve"> (TensorFlow LSTM vs ARIMA)</w:t>
-      </w:r>
-      <w:r>
-        <w:rPr>
-          <w:b/>
-          <w:color w:val="003366"/>
-          <w:sz w:val="16"/>
-        </w:rPr>
-        <w:tab/>
-        <w:t>2024 – 2025</w:t>
-      </w:r>
-    </w:p>
-    <w:p>
-      <w:pPr>
-        <w:pStyle w:val="ListBullet"/>
-        <w:spacing w:before="0" w:after="20" w:line="245" w:lineRule="auto"/>
-      </w:pPr>
-      <w:r>
-        <w:rPr>
-          <w:sz w:val="16"/>
-        </w:rPr>
-        <w:t>Modeled 55k+ retail transactions comparing ARIMA baseline with LSTM Neural Networks to forecast volume and capture non-linear trends.</w:t>
-      </w:r>
-    </w:p>
-    <w:p>
-      <w:pPr>
-        <w:pStyle w:val="ListBullet"/>
-        <w:spacing w:before="0" w:after="20" w:line="245" w:lineRule="auto"/>
-      </w:pPr>
-      <w:r>
-        <w:rPr>
-          <w:sz w:val="16"/>
-        </w:rPr>
-        <w:t>Integrated promotional exogenous drivers (onpromotion) and commodity prices, proving promotional lift impact over macroeconomic drivers.</w:t>
-      </w:r>
-    </w:p>
-    <w:p>
-      <w:pPr>
-        <w:keepNext/>
-        <w:spacing w:before="40" w:after="20"/>
-        <w:tabs>
-          <w:tab w:val="right" w:pos="10700"/>
-        </w:tabs>
-      </w:pPr>
-      <w:r>
-        <w:rPr>
-          <w:b/>
-          <w:sz w:val="17"/>
-        </w:rPr>
-        <w:t>Credit Card Fraud Detection &amp; Behavioral Pipeline</w:t>
-      </w:r>
-      <w:r>
-        <w:rPr>
-          <w:i/>
-          <w:color w:val="5A5A5A"/>
-          <w:sz w:val="16"/>
-        </w:rPr>
-        <w:t xml:space="preserve"> (Scikit-Learn, Random Forest, Imbalanced Learning)</w:t>
-      </w:r>
-      <w:r>
-        <w:rPr>
-          <w:b/>
-          <w:color w:val="003366"/>
-          <w:sz w:val="16"/>
-        </w:rPr>
-        <w:tab/>
-        <w:t>2024 – 2025</w:t>
-      </w:r>
-    </w:p>
-    <w:p>
-      <w:pPr>
-        <w:pStyle w:val="ListBullet"/>
-        <w:spacing w:before="0" w:after="20" w:line="245" w:lineRule="auto"/>
-      </w:pPr>
-      <w:r>
-        <w:rPr>
-          <w:sz w:val="16"/>
-        </w:rPr>
-        <w:t>Constructed a high-precision fraud detection engine on extreme imbalanced data (0.58% fraud rate) with class_weight='balanced'.</w:t>
-      </w:r>
-    </w:p>
-    <w:p>
-      <w:pPr>
-        <w:pStyle w:val="ListBullet"/>
-        <w:spacing w:before="0" w:after="20" w:line="245" w:lineRule="auto"/>
-      </w:pPr>
-      <w:r>
-        <w:rPr>
-          <w:sz w:val="16"/>
-        </w:rPr>
-        <w:t>Engineered complex behavioral features: transaction velocity (velocity_1h), time delta (diff_trans), rolling averages, and Haversine distance.</w:t>
-      </w:r>
-    </w:p>
-    <w:p>
-      <w:pPr>
-        <w:keepNext/>
-        <w:spacing w:before="40" w:after="20"/>
-        <w:tabs>
-          <w:tab w:val="right" w:pos="10700"/>
-        </w:tabs>
-      </w:pPr>
-      <w:r>
-        <w:rPr>
-          <w:b/>
-          <w:sz w:val="17"/>
-        </w:rPr>
-        <w:t>Metaheuristic Optimization &amp; Neural Algorithm Development</w:t>
-      </w:r>
-      <w:r>
-        <w:rPr>
-          <w:i/>
-          <w:color w:val="5A5A5A"/>
-          <w:sz w:val="16"/>
-        </w:rPr>
-        <w:t xml:space="preserve"> (Python, NumPy from scratch)</w:t>
-      </w:r>
-      <w:r>
-        <w:rPr>
-          <w:b/>
-          <w:color w:val="003366"/>
-          <w:sz w:val="16"/>
-        </w:rPr>
-        <w:tab/>
-        <w:t>2024</w:t>
-      </w:r>
-    </w:p>
-    <w:p>
-      <w:pPr>
-        <w:pStyle w:val="ListBullet"/>
-        <w:spacing w:before="0" w:after="20" w:line="245" w:lineRule="auto"/>
-      </w:pPr>
-      <w:r>
-        <w:rPr>
-          <w:sz w:val="16"/>
-        </w:rPr>
-        <w:t>Designed a custom Genetic Algorithm (SchedulingGA) for multi-constraint resource optimization and built a Perceptron ANN from scratch.</w:t>
-      </w:r>
-    </w:p>
-    <w:p>
-      <w:pPr>
-        <w:keepNext/>
-        <w:spacing w:before="100" w:after="40"/>
-        <w:pBdr>
-          <w:bottom w:val="single" w:sz="10" w:space="2" w:color="003366"/>
-        </w:pBdr>
-      </w:pPr>
-      <w:r>
-        <w:rPr>
-          <w:rFonts w:ascii="Arial" w:hAnsi="Arial"/>
-          <w:b/>
-          <w:color w:val="003366"/>
-          <w:sz w:val="19"/>
-        </w:rPr>
-        <w:t>WORK EXPERIENCE</w:t>
-      </w:r>
-    </w:p>
-    <w:p>
-      <w:pPr>
-        <w:keepNext/>
-        <w:spacing w:before="30" w:after="20"/>
-        <w:tabs>
-          <w:tab w:val="right" w:pos="10700"/>
-        </w:tabs>
-      </w:pPr>
-      <w:r>
-        <w:rPr>
-          <w:b/>
-          <w:sz w:val="17"/>
-        </w:rPr>
-        <w:t>Quality Assurance Engineer — Gokomodo</w:t>
-      </w:r>
-      <w:r>
-        <w:rPr>
-          <w:i/>
-          <w:color w:val="5A5A5A"/>
-          <w:sz w:val="16"/>
-        </w:rPr>
-        <w:t xml:space="preserve"> | Full-time (South Jakarta - On-site)</w:t>
-      </w:r>
-      <w:r>
-        <w:rPr>
-          <w:b/>
-          <w:color w:val="003366"/>
-          <w:sz w:val="16"/>
+          <w:color w:val="141414"/>
+          <w:sz w:val="18"/>
         </w:rPr>
         <w:tab/>
         <w:t>Oct 2022 – Aug 2024</w:t>
@@ -501,43 +369,84 @@
     <w:p>
       <w:pPr>
         <w:pStyle w:val="ListBullet"/>
-        <w:spacing w:before="0" w:after="20" w:line="245" w:lineRule="auto"/>
+        <w:spacing w:before="0" w:after="24" w:line="247" w:lineRule="auto"/>
+        <w:ind w:left="288"/>
       </w:pPr>
       <w:r>
         <w:rPr>
-          <w:sz w:val="16"/>
+          <w:rFonts w:ascii="Times New Roman" w:hAnsi="Times New Roman"/>
+          <w:color w:val="141414"/>
+          <w:sz w:val="17"/>
         </w:rPr>
-        <w:t>Executed test scenarios, test cases, Agile cross-functional collaboration, and backend database validation for B2B e-commerce platforms.</w:t>
+        <w:t>Led end-to-end quality assurance, test scenario design, cross-functional Agile collaboration, and backend database validation for enterprise B2B e-commerce platforms.</w:t>
+      </w:r>
+    </w:p>
+    <w:p>
+      <w:pPr>
+        <w:pStyle w:val="ListBullet"/>
+        <w:spacing w:before="0" w:after="24" w:line="247" w:lineRule="auto"/>
+        <w:ind w:left="288"/>
+      </w:pPr>
+      <w:r>
+        <w:rPr>
+          <w:rFonts w:ascii="Times New Roman" w:hAnsi="Times New Roman"/>
+          <w:color w:val="141414"/>
+          <w:sz w:val="17"/>
+        </w:rPr>
+        <w:t>Formulated complex SQL validation queries and API integration tests to ensure data integrity across transactional pipelines.</w:t>
       </w:r>
     </w:p>
     <w:p>
       <w:pPr>
         <w:keepNext/>
-        <w:spacing w:before="30" w:after="20"/>
+        <w:spacing w:before="50" w:after="10" w:line="247" w:lineRule="auto"/>
         <w:tabs>
-          <w:tab w:val="right" w:pos="10700"/>
+          <w:tab w:val="right" w:pos="10469"/>
         </w:tabs>
       </w:pPr>
       <w:r>
         <w:rPr>
+          <w:rFonts w:ascii="Times New Roman" w:hAnsi="Times New Roman"/>
           <w:b/>
-          <w:sz w:val="17"/>
+          <w:color w:val="000000"/>
+          <w:sz w:val="19"/>
         </w:rPr>
-        <w:t>Software Quality Assurance — Anteraja</w:t>
+        <w:t>ANTERAJA</w:t>
       </w:r>
       <w:r>
         <w:rPr>
+          <w:rFonts w:ascii="Times New Roman" w:hAnsi="Times New Roman"/>
+          <w:b/>
+          <w:color w:val="000000"/>
+          <w:sz w:val="19"/>
+        </w:rPr>
+        <w:tab/>
+        <w:t>South Jakarta, Indonesia</w:t>
+      </w:r>
+    </w:p>
+    <w:p>
+      <w:pPr>
+        <w:keepNext/>
+        <w:spacing w:before="0" w:after="30" w:line="247" w:lineRule="auto"/>
+        <w:tabs>
+          <w:tab w:val="right" w:pos="10469"/>
+        </w:tabs>
+      </w:pPr>
+      <w:r>
+        <w:rPr>
+          <w:rFonts w:ascii="Times New Roman" w:hAnsi="Times New Roman"/>
           <w:i/>
-          <w:color w:val="5A5A5A"/>
-          <w:sz w:val="16"/>
+          <w:color w:val="141414"/>
+          <w:sz w:val="18"/>
         </w:rPr>
-        <w:t xml:space="preserve"> | Contract (South Jakarta - Hybrid)</w:t>
+        <w:t>Software Quality Assurance (Contract)</w:t>
       </w:r>
       <w:r>
         <w:rPr>
-          <w:b/>
-          <w:color w:val="003366"/>
-          <w:sz w:val="16"/>
+          <w:rFonts w:ascii="Times New Roman" w:hAnsi="Times New Roman"/>
+          <w:i/>
+          <w:color w:val="141414"/>
+          <w:sz w:val="18"/>
         </w:rPr>
         <w:tab/>
         <w:t>Oct 2021 – Sep 2022</w:t>
@@ -546,43 +455,69 @@
     <w:p>
       <w:pPr>
         <w:pStyle w:val="ListBullet"/>
-        <w:spacing w:before="0" w:after="20" w:line="245" w:lineRule="auto"/>
+        <w:spacing w:before="0" w:after="24" w:line="247" w:lineRule="auto"/>
+        <w:ind w:left="288"/>
       </w:pPr>
       <w:r>
         <w:rPr>
-          <w:sz w:val="16"/>
+          <w:rFonts w:ascii="Times New Roman" w:hAnsi="Times New Roman"/>
+          <w:color w:val="141414"/>
+          <w:sz w:val="17"/>
         </w:rPr>
-        <w:t>Conducted functional, integration, and regression testing for high-volume logistics and tracking systems using JIRA and TestRail.</w:t>
+        <w:t>Executed functional, integration, regression, and data verification testing for high-volume logistics and package tracking workflows using JIRA, TestRail, and database auditing.</w:t>
       </w:r>
     </w:p>
     <w:p>
       <w:pPr>
         <w:keepNext/>
-        <w:spacing w:before="30" w:after="20"/>
+        <w:spacing w:before="50" w:after="10" w:line="247" w:lineRule="auto"/>
         <w:tabs>
-          <w:tab w:val="right" w:pos="10700"/>
+          <w:tab w:val="right" w:pos="10469"/>
         </w:tabs>
       </w:pPr>
       <w:r>
         <w:rPr>
+          <w:rFonts w:ascii="Times New Roman" w:hAnsi="Times New Roman"/>
           <w:b/>
-          <w:sz w:val="17"/>
+          <w:color w:val="000000"/>
+          <w:sz w:val="19"/>
         </w:rPr>
-        <w:t>Software Quality Assurance Intern — Transfree</w:t>
+        <w:t>TRANSFREE</w:t>
       </w:r>
       <w:r>
         <w:rPr>
+          <w:rFonts w:ascii="Times New Roman" w:hAnsi="Times New Roman"/>
+          <w:b/>
+          <w:color w:val="000000"/>
+          <w:sz w:val="19"/>
+        </w:rPr>
+        <w:tab/>
+        <w:t>South Jakarta, Indonesia</w:t>
+      </w:r>
+    </w:p>
+    <w:p>
+      <w:pPr>
+        <w:keepNext/>
+        <w:spacing w:before="0" w:after="30" w:line="247" w:lineRule="auto"/>
+        <w:tabs>
+          <w:tab w:val="right" w:pos="10469"/>
+        </w:tabs>
+      </w:pPr>
+      <w:r>
+        <w:rPr>
+          <w:rFonts w:ascii="Times New Roman" w:hAnsi="Times New Roman"/>
           <w:i/>
-          <w:color w:val="5A5A5A"/>
-          <w:sz w:val="16"/>
+          <w:color w:val="141414"/>
+          <w:sz w:val="18"/>
         </w:rPr>
-        <w:t xml:space="preserve"> | Internship (South Jakarta)</w:t>
+        <w:t>Software Quality Assurance Intern</w:t>
       </w:r>
       <w:r>
         <w:rPr>
-          <w:b/>
-          <w:color w:val="003366"/>
-          <w:sz w:val="16"/>
+          <w:rFonts w:ascii="Times New Roman" w:hAnsi="Times New Roman"/>
+          <w:i/>
+          <w:color w:val="141414"/>
+          <w:sz w:val="18"/>
         </w:rPr>
         <w:tab/>
         <w:t>May 2021 – Jul 2021</w:t>
@@ -591,98 +526,351 @@
     <w:p>
       <w:pPr>
         <w:pStyle w:val="ListBullet"/>
-        <w:spacing w:before="0" w:after="20" w:line="245" w:lineRule="auto"/>
+        <w:spacing w:before="0" w:after="24" w:line="247" w:lineRule="auto"/>
+        <w:ind w:left="288"/>
       </w:pPr>
       <w:r>
         <w:rPr>
-          <w:sz w:val="16"/>
+          <w:rFonts w:ascii="Times New Roman" w:hAnsi="Times New Roman"/>
+          <w:color w:val="141414"/>
+          <w:sz w:val="17"/>
         </w:rPr>
-        <w:t>Assisted in creating test plans, smoke testing, and UAT for cross-border financial transaction mobile applications.</w:t>
+        <w:t>Assisted in test plan design, test execution, API verification, and UAT for cross-border financial transaction and remittance systems.</w:t>
       </w:r>
     </w:p>
     <w:p>
       <w:pPr>
         <w:keepNext/>
-        <w:spacing w:before="100" w:after="40"/>
+        <w:spacing w:before="90" w:after="40"/>
         <w:pBdr>
-          <w:bottom w:val="single" w:sz="10" w:space="2" w:color="003366"/>
+          <w:bottom w:val="single" w:sz="8" w:space="2" w:color="000000"/>
         </w:pBdr>
       </w:pPr>
       <w:r>
         <w:rPr>
-          <w:rFonts w:ascii="Arial" w:hAnsi="Arial"/>
+          <w:rFonts w:ascii="Times New Roman" w:hAnsi="Times New Roman"/>
           <w:b/>
-          <w:color w:val="003366"/>
-          <w:sz w:val="19"/>
+          <w:color w:val="000000"/>
+          <w:sz w:val="21"/>
         </w:rPr>
-        <w:t>EDUCATION</w:t>
+        <w:t>RELEVANT DATA SCIENCE &amp; AI PROJECTS</w:t>
       </w:r>
     </w:p>
     <w:p>
       <w:pPr>
-        <w:spacing w:before="30" w:after="10"/>
+        <w:keepNext/>
+        <w:spacing w:before="40" w:after="10" w:line="247" w:lineRule="auto"/>
         <w:tabs>
-          <w:tab w:val="right" w:pos="10700"/>
+          <w:tab w:val="right" w:pos="10469"/>
         </w:tabs>
       </w:pPr>
       <w:r>
         <w:rPr>
+          <w:rFonts w:ascii="Times New Roman" w:hAnsi="Times New Roman"/>
           <w:b/>
-          <w:sz w:val="17"/>
+          <w:color w:val="000000"/>
+          <w:sz w:val="19"/>
         </w:rPr>
-        <w:t>Magister Sains Data dan Kecerdasan Buatan (S2 DSAI)</w:t>
+        <w:t>Early Warning System (EWS) Attendance Anomaly Web App</w:t>
       </w:r>
       <w:r>
         <w:rPr>
-          <w:i/>
-          <w:sz w:val="16"/>
-        </w:rPr>
-        <w:t xml:space="preserve"> | Universitas Sumatera Utara (USU)</w:t>
-      </w:r>
-      <w:r>
-        <w:rPr>
+          <w:rFonts w:ascii="Times New Roman" w:hAnsi="Times New Roman"/>
           <w:b/>
-          <w:color w:val="003366"/>
-          <w:sz w:val="16"/>
+          <w:color w:val="000000"/>
+          <w:sz w:val="19"/>
         </w:rPr>
         <w:tab/>
-        <w:t>2024 – 2026</w:t>
+        <w:t>2025 – 2026</w:t>
       </w:r>
     </w:p>
     <w:p>
       <w:pPr>
-        <w:spacing w:before="10" w:after="20"/>
+        <w:keepNext/>
+        <w:spacing w:before="0" w:after="30" w:line="247" w:lineRule="auto"/>
         <w:tabs>
-          <w:tab w:val="right" w:pos="10700"/>
+          <w:tab w:val="right" w:pos="10469"/>
         </w:tabs>
       </w:pPr>
       <w:r>
         <w:rPr>
-          <w:b/>
+          <w:rFonts w:ascii="Times New Roman" w:hAnsi="Times New Roman"/>
+          <w:i/>
+          <w:color w:val="141414"/>
+          <w:sz w:val="18"/>
+        </w:rPr>
+        <w:t>Technologies: Python, Flask, PyOD (Isolation Forest, LOF, ECOD), SHAP XAI, Leaflet.js, Plotly</w:t>
+      </w:r>
+    </w:p>
+    <w:p>
+      <w:pPr>
+        <w:pStyle w:val="ListBullet"/>
+        <w:spacing w:before="0" w:after="24" w:line="247" w:lineRule="auto"/>
+        <w:ind w:left="288"/>
+      </w:pPr>
+      <w:r>
+        <w:rPr>
+          <w:rFonts w:ascii="Times New Roman" w:hAnsi="Times New Roman"/>
+          <w:color w:val="141414"/>
           <w:sz w:val="17"/>
         </w:rPr>
-        <w:t>D-IV Teknologi Informasi / Rekayasa Perangkat Lunak</w:t>
+        <w:t>Built an end-to-end production Flask web application deploying an ensemble of Isolation Forest, LOF, and ECOD for multi-algorithm outlier detection.</w:t>
+      </w:r>
+    </w:p>
+    <w:p>
+      <w:pPr>
+        <w:pStyle w:val="ListBullet"/>
+        <w:spacing w:before="0" w:after="24" w:line="247" w:lineRule="auto"/>
+        <w:ind w:left="288"/>
+      </w:pPr>
+      <w:r>
+        <w:rPr>
+          <w:rFonts w:ascii="Times New Roman" w:hAnsi="Times New Roman"/>
+          <w:color w:val="141414"/>
+          <w:sz w:val="17"/>
+        </w:rPr>
+        <w:t>Integrated SHAP (XAI) for transparent feature attribution, automated data preprocessing, and Leaflet.js interactive geospatial mapping with automated Excel reporting.</w:t>
+      </w:r>
+    </w:p>
+    <w:p>
+      <w:pPr>
+        <w:keepNext/>
+        <w:spacing w:before="50" w:after="10" w:line="247" w:lineRule="auto"/>
+        <w:tabs>
+          <w:tab w:val="right" w:pos="10469"/>
+        </w:tabs>
+      </w:pPr>
+      <w:r>
+        <w:rPr>
+          <w:rFonts w:ascii="Times New Roman" w:hAnsi="Times New Roman"/>
+          <w:b/>
+          <w:color w:val="000000"/>
+          <w:sz w:val="19"/>
+        </w:rPr>
+        <w:t>Beverages Sales Time Series Forecasting Engine</w:t>
       </w:r>
       <w:r>
         <w:rPr>
+          <w:rFonts w:ascii="Times New Roman" w:hAnsi="Times New Roman"/>
+          <w:b/>
+          <w:color w:val="000000"/>
+          <w:sz w:val="19"/>
+        </w:rPr>
+        <w:tab/>
+        <w:t>2024 – 2025</w:t>
+      </w:r>
+    </w:p>
+    <w:p>
+      <w:pPr>
+        <w:keepNext/>
+        <w:spacing w:before="0" w:after="30" w:line="247" w:lineRule="auto"/>
+        <w:tabs>
+          <w:tab w:val="right" w:pos="10469"/>
+        </w:tabs>
+      </w:pPr>
+      <w:r>
+        <w:rPr>
+          <w:rFonts w:ascii="Times New Roman" w:hAnsi="Times New Roman"/>
           <w:i/>
-          <w:sz w:val="16"/>
+          <w:color w:val="141414"/>
+          <w:sz w:val="18"/>
         </w:rPr>
-        <w:t xml:space="preserve"> | Institut Teknologi Del</w:t>
+        <w:t>Technologies: TensorFlow, Keras LSTM, Statsmodels ARIMA, Scikit-Learn, Pandas</w:t>
+      </w:r>
+    </w:p>
+    <w:p>
+      <w:pPr>
+        <w:pStyle w:val="ListBullet"/>
+        <w:spacing w:before="0" w:after="24" w:line="247" w:lineRule="auto"/>
+        <w:ind w:left="288"/>
+      </w:pPr>
+      <w:r>
+        <w:rPr>
+          <w:rFonts w:ascii="Times New Roman" w:hAnsi="Times New Roman"/>
+          <w:color w:val="141414"/>
+          <w:sz w:val="17"/>
+        </w:rPr>
+        <w:t>Modeled 55k+ retail transactions comparing ARIMA baseline against Multi-layer LSTM Neural Networks to forecast demand volume and capture non-linear trends.</w:t>
+      </w:r>
+    </w:p>
+    <w:p>
+      <w:pPr>
+        <w:pStyle w:val="ListBullet"/>
+        <w:spacing w:before="0" w:after="24" w:line="247" w:lineRule="auto"/>
+        <w:ind w:left="288"/>
+      </w:pPr>
+      <w:r>
+        <w:rPr>
+          <w:rFonts w:ascii="Times New Roman" w:hAnsi="Times New Roman"/>
+          <w:color w:val="141414"/>
+          <w:sz w:val="17"/>
+        </w:rPr>
+        <w:t>Evaluated exogenous promotional drivers (onpromotion) and commodity prices, demonstrating significant forecast accuracy improvements over baseline models.</w:t>
+      </w:r>
+    </w:p>
+    <w:p>
+      <w:pPr>
+        <w:keepNext/>
+        <w:spacing w:before="50" w:after="10" w:line="247" w:lineRule="auto"/>
+        <w:tabs>
+          <w:tab w:val="right" w:pos="10469"/>
+        </w:tabs>
+      </w:pPr>
+      <w:r>
+        <w:rPr>
+          <w:rFonts w:ascii="Times New Roman" w:hAnsi="Times New Roman"/>
+          <w:b/>
+          <w:color w:val="000000"/>
+          <w:sz w:val="19"/>
+        </w:rPr>
+        <w:t>Credit Card Fraud Detection &amp; Behavioral Feature Pipeline</w:t>
       </w:r>
       <w:r>
         <w:rPr>
+          <w:rFonts w:ascii="Times New Roman" w:hAnsi="Times New Roman"/>
           <w:b/>
-          <w:color w:val="003366"/>
-          <w:sz w:val="16"/>
+          <w:color w:val="000000"/>
+          <w:sz w:val="19"/>
         </w:rPr>
         <w:tab/>
-        <w:t>2017 – 2021</w:t>
+        <w:t>2024 – 2025</w:t>
+      </w:r>
+    </w:p>
+    <w:p>
+      <w:pPr>
+        <w:keepNext/>
+        <w:spacing w:before="0" w:after="30" w:line="247" w:lineRule="auto"/>
+        <w:tabs>
+          <w:tab w:val="right" w:pos="10469"/>
+        </w:tabs>
+      </w:pPr>
+      <w:r>
+        <w:rPr>
+          <w:rFonts w:ascii="Times New Roman" w:hAnsi="Times New Roman"/>
+          <w:i/>
+          <w:color w:val="141414"/>
+          <w:sz w:val="18"/>
+        </w:rPr>
+        <w:t>Technologies: Scikit-Learn, Random Forest, Imbalanced Learning, Feature Engineering</w:t>
+      </w:r>
+    </w:p>
+    <w:p>
+      <w:pPr>
+        <w:pStyle w:val="ListBullet"/>
+        <w:spacing w:before="0" w:after="24" w:line="247" w:lineRule="auto"/>
+        <w:ind w:left="288"/>
+      </w:pPr>
+      <w:r>
+        <w:rPr>
+          <w:rFonts w:ascii="Times New Roman" w:hAnsi="Times New Roman"/>
+          <w:color w:val="141414"/>
+          <w:sz w:val="17"/>
+        </w:rPr>
+        <w:t>Constructed a high-precision fraud detection engine on extreme imbalanced data (0.58% fraud rate) utilizing Random Forest with cost-sensitive class balancing.</w:t>
+      </w:r>
+    </w:p>
+    <w:p>
+      <w:pPr>
+        <w:pStyle w:val="ListBullet"/>
+        <w:spacing w:before="0" w:after="24" w:line="247" w:lineRule="auto"/>
+        <w:ind w:left="288"/>
+      </w:pPr>
+      <w:r>
+        <w:rPr>
+          <w:rFonts w:ascii="Times New Roman" w:hAnsi="Times New Roman"/>
+          <w:color w:val="141414"/>
+          <w:sz w:val="17"/>
+        </w:rPr>
+        <w:t>Engineered behavioral domain features including transaction velocity (velocity_1h), time deltas, rolling expenditure averages, and Haversine distance.</w:t>
+      </w:r>
+    </w:p>
+    <w:p>
+      <w:pPr>
+        <w:keepNext/>
+        <w:spacing w:before="90" w:after="40"/>
+        <w:pBdr>
+          <w:bottom w:val="single" w:sz="8" w:space="2" w:color="000000"/>
+        </w:pBdr>
+      </w:pPr>
+      <w:r>
+        <w:rPr>
+          <w:rFonts w:ascii="Times New Roman" w:hAnsi="Times New Roman"/>
+          <w:b/>
+          <w:color w:val="000000"/>
+          <w:sz w:val="21"/>
+        </w:rPr>
+        <w:t>TECHNICAL SKILLS</w:t>
+      </w:r>
+    </w:p>
+    <w:p>
+      <w:pPr>
+        <w:spacing w:before="20" w:after="24" w:line="247" w:lineRule="auto"/>
+      </w:pPr>
+      <w:r>
+        <w:rPr>
+          <w:rFonts w:ascii="Times New Roman" w:hAnsi="Times New Roman"/>
+          <w:b/>
+          <w:color w:val="000000"/>
+          <w:sz w:val="17"/>
+        </w:rPr>
+        <w:t xml:space="preserve">•  Machine Learning &amp; AI: </w:t>
+      </w:r>
+      <w:r>
+        <w:rPr>
+          <w:rFonts w:ascii="Times New Roman" w:hAnsi="Times New Roman"/>
+          <w:color w:val="141414"/>
+          <w:sz w:val="17"/>
+        </w:rPr>
+        <w:t>Scikit-Learn, TensorFlow/Keras, PyOD (Isolation Forest, LOF, ECOD), Random Forest, SHAP (XAI), Imbalanced Classification, Genetic Algorithms.</w:t>
+      </w:r>
+    </w:p>
+    <w:p>
+      <w:pPr>
+        <w:spacing w:before="20" w:after="24" w:line="247" w:lineRule="auto"/>
+      </w:pPr>
+      <w:r>
+        <w:rPr>
+          <w:rFonts w:ascii="Times New Roman" w:hAnsi="Times New Roman"/>
+          <w:b/>
+          <w:color w:val="000000"/>
+          <w:sz w:val="17"/>
+        </w:rPr>
+        <w:t xml:space="preserve">•  Data Science &amp; Analytics: </w:t>
+      </w:r>
+      <w:r>
+        <w:rPr>
+          <w:rFonts w:ascii="Times New Roman" w:hAnsi="Times New Roman"/>
+          <w:color w:val="141414"/>
+          <w:sz w:val="17"/>
+        </w:rPr>
+        <w:t>Python (Pandas, NumPy, Scipy), SQL (PostgreSQL, MySQL), Time Series Forecasting (LSTM, ARIMA), Feature Engineering, Statistical Analysis, EDA.</w:t>
+      </w:r>
+    </w:p>
+    <w:p>
+      <w:pPr>
+        <w:spacing w:before="20" w:after="24" w:line="247" w:lineRule="auto"/>
+      </w:pPr>
+      <w:r>
+        <w:rPr>
+          <w:rFonts w:ascii="Times New Roman" w:hAnsi="Times New Roman"/>
+          <w:b/>
+          <w:color w:val="000000"/>
+          <w:sz w:val="17"/>
+        </w:rPr>
+        <w:t xml:space="preserve">•  Geospatial &amp; Web Tools: </w:t>
+      </w:r>
+      <w:r>
+        <w:rPr>
+          <w:rFonts w:ascii="Times New Roman" w:hAnsi="Times New Roman"/>
+          <w:color w:val="141414"/>
+          <w:sz w:val="17"/>
+        </w:rPr>
+        <w:t>ST-DBSCAN, Spatial DBSCAN, Haversine Distance, Flask, Streamlit, PyDeck 3D, Leaflet.js, Git/GitHub, JIRA, Postman.</w:t>
       </w:r>
     </w:p>
     <w:sectPr>
-      <w:pgSz w:w="12240" w:h="15840"/>
-      <w:pgMar w:top="547" w:right="720" w:bottom="547" w:left="720" w:header="720" w:footer="720" w:gutter="0"/>
+      <w:pgSz w:w="11909" w:h="16834"/>
+      <w:pgMar w:top="576" w:right="720" w:bottom="576" w:left="720" w:header="720" w:footer="720" w:gutter="0"/>
       <w:cols w:space="720"/>
       <w:docGrid w:linePitch="360"/>
     </w:sectPr>
@@ -1054,9 +1242,9 @@
     <w:qFormat/>
     <w:rsid w:val="00FC693F"/>
     <w:rPr>
-      <w:rFonts w:ascii="Arial" w:hAnsi="Arial"/>
-      <w:color w:val="222222"/>
-      <w:sz w:val="17"/>
+      <w:rFonts w:ascii="Times New Roman" w:hAnsi="Times New Roman"/>
+      <w:color w:val="141414"/>
+      <w:sz w:val="19"/>
     </w:rPr>
   </w:style>
   <w:style w:type="paragraph" w:styleId="Header">

</xml_diff>